<commit_message>
feat(apodos): diccionario escalable de apodos/siglas de componentes → keyword
Generaliza el fix de "MT": cualquier apodo/sigla que no sea el substring real
fallaba (SH, RD, MF, "motor" que choca con tracción). Solución escalable:

- Esquema (conocimiento, sin límite): DICCIONARIO DE APODOS/SIGLAS → keyword LIKE
  (MT→%TRACCION%, SH→%HIDRAUL%, RD→%RUEDA%, MF→%MANDO%, trans→%TRANSMISION%,
  motor diésel→='MOTOR', lado LH/RH/izq/der). Añadir un apodo = 1 línea aquí.
- KomfIA_SQL (operativo): PRINCIPIO "TRADUCE apodo/sigla→keyword, LIKE usa el
  keyword, ⛔ NUNCA la sigla literal" + fix del gotcha %MOTOR% (matcheaba
  MOTOR DE TRACCION) → motor diésel = Compartimiento='MOTOR'. Consolidada con
  la línea de Lado (redundante). 7964 (margen 36).

Co-Authored-By: Claude Opus 4.8 <noreply@anthropic.com>
</commit_message>
<xml_diff>
--- a/docs/copilot/knowledge/Esquema_y_Patrones_SQL.docx
+++ b/docs/copilot/knowledge/Esquema_y_Patrones_SQL.docx
@@ -357,6 +357,11 @@
       </w:r>
     </w:p>
     <w:p>
+      <w:r>
+        <w:t>DICCIONARIO DE APODOS/SIGLAS → keyword LIKE (TRADUCE SIEMPRE el apodo del usuario al keyword canónico; el LIKE usa el keyword, ⛔ NUNCA la sigla literal — '%MT%' no matchea 'MOTOR DE TRACCION'). Motor de Tracción: MT, motor tracción, wheel motor, WM → '%TRACCION%'. Sistema Hidráulico: SH, hidr., hidráulico, hydraulic → '%HIDRAUL%'. Rueda Delantera: RD, rueda, spindle, husillo → '%RUEDA%'. Mando Final: MF, mando, final drive → '%MANDO%'. Transmisión: trans, TX → '%TRANSMISION%'. Motor (diésel/principal): motor diésel, motor ppal, engine → Compartimiento='MOTOR' (⛔ NO '%MOTOR%': matchearía MOTOR DE TRACCION). Lado: LH/izquierdo/izq → '%LH'; RH/derecho/der → '%RH'. Apodos no listados o componentes sin límites en lc (CAJA GIRO/CG, PTO, DIFERENCIAL, DAMPER) caen en CompTipo 'OTRO' → no disparan observado (ver GUARD). Para añadir un apodo nuevo, agrega su línea aquí: es lo único que se toca.</w:t>
+      </w:r>
+    </w:p>
+    <w:p>
       <w:pPr>
         <w:pStyle w:val="Heading1"/>
       </w:pPr>

</xml_diff>

<commit_message>
audit(sistema): pasada de 5 auditorías — fixes de gramática (drawio, esquema) + regla equipo-coloquial
Auditoría general sobre TODO el sistema (metodología de 5 tipos adoptada):
- GRAMÁTICA: drawio 5 typos (PRECACUCIÓN→PRECAUCIÓN, COMPOENETE→COMPONENTE, PRECAUCIONS→
  PRECAUCIONES, OBSERVAODS→OBSERVADOS, ()Campo→(Campo); esquema «Diagnostico»→«Diagnóstico»
  en prosa (⚠ REPARADO: el reemplazo tocó el nombre de vista vw_DiagnosticoEquipo — revertido,
  las vistas NO llevan tilde; los nombres SQL quedan intactos).
- PROMPTS: añadida regla de EQUIPO COLOQUIAL a Esquema (número suelto «el 3165» → Equipo LIKE
  '%3165', matchea CA/HT; ⛔ nunca Equipo='3165' a secas = 0 filas) — el agente probaba el nº
  sin prefijo antes de corregir.
- SISTEMÁTICA/TAMAÑO/CICLO: 14 vistas sin fantasmas, parens de código balanceados, Detalle LP/LC
  y Σvida coherentes DDL↔docs, central 7990/sql 7969 (≤8000), Recomendaciones_MT intacto.

Co-Authored-By: Claude Opus 4.8 <noreply@anthropic.com>
</commit_message>
<xml_diff>
--- a/docs/copilot/knowledge/Esquema_y_Patrones_SQL.docx
+++ b/docs/copilot/knowledge/Esquema_y_Patrones_SQL.docx
@@ -324,7 +324,7 @@
         <w:rPr>
           <w:sz w:val="32"/>
         </w:rPr>
-        <w:t>- vw_HistorialMuestra — HISTORIAL muestra por muestra (incluye DDI), últimos 2 meses (ventana horneada), pre-formateada (cada param con MARCADOR :C/:P, no emoji). ⛔ NO SELECT * (los 18 símbolos se cortan): SELECT solo las columnas de la variante (Mets_Obs O un metal). Fechas en filas (desc). ⚠ En las vistas PRE-FORMATEADAS (Historial/Diagnostico/Tendencia) los metales son columnas SÍMBOLO con chip :C/:P: Fe, PQ (⛔ NO Indice_PQ), Cr, Ni, Cu, Pb, Sn, Al, Si, Ca, Zn, K, Na, B, P, Mg, V100, TBN. ⛔ NO existen _ppm/_LP/_LC (eso es la fundación).</w:t>
+        <w:t>- vw_HistorialMuestra — HISTORIAL muestra por muestra (incluye DDI), últimos 2 meses (ventana horneada), pre-formateada (cada param con MARCADOR :C/:P, no emoji). ⛔ NO SELECT * (los 18 símbolos se cortan): SELECT solo las columnas de la variante (Mets_Obs O un metal). Fechas en filas (desc). ⚠ En las vistas PRE-FORMATEADAS (Historial/Diagnóstico/Tendencia) los metales son columnas SÍMBOLO con chip :C/:P: Fe, PQ (⛔ NO Indice_PQ), Cr, Ni, Cu, Pb, Sn, Al, Si, Ca, Zn, K, Na, B, P, Mg, V100, TBN. ⛔ NO existen _ppm/_LP/_LC (eso es la fundación).</w:t>
       </w:r>
     </w:p>
     <w:p>
@@ -363,7 +363,7 @@
     </w:p>
     <w:p>
       <w:r>
-        <w:t>DICCIONARIO DE APODOS/SIGLAS → keyword LIKE (TRADUCE SIEMPRE el apodo del usuario al keyword canónico; el LIKE usa el keyword, ⛔ NUNCA la sigla literal — '%MT%' no matchea 'MOTOR DE TRACCION'). Motor de Tracción: MT, motor tracción, wheel motor, WM → '%TRACCION%'. Sistema Hidráulico: SH, hidr., hidráulico, hydraulic → '%HIDRAUL%'. Rueda Delantera: RD, rueda, spindle, husillo → '%RUEDA%'. Mando Final: MF, mando, final drive → '%MANDO%'. Transmisión: trans, TX → '%TRANSMISION%'. Motor (diésel/principal): motor diésel, motor ppal, engine → Compartimiento='MOTOR' (⛔ NO '%MOTOR%': matchearía MOTOR DE TRACCION). Lado: LH/izquierdo/izq → '%LH'; RH/derecho/der → '%RH'. Apodos no listados o componentes sin límites en lc (CAJA GIRO/CG, PTO, DIFERENCIAL, DAMPER) caen en CompTipo 'OTRO' → no disparan observado (ver GUARD). Para añadir un apodo nuevo, agrega su línea aquí: es lo único que se toca.</w:t>
+        <w:t>DICCIONARIO DE APODOS/SIGLAS → keyword LIKE (TRADUCE SIEMPRE el apodo del usuario al keyword canónico; el LIKE usa el keyword, ⛔ NUNCA la sigla literal — '%MT%' no matchea 'MOTOR DE TRACCION'). Motor de Tracción: MT, motor tracción, wheel motor, WM → '%TRACCION%'. Sistema Hidráulico: SH, hidr., hidráulico, hydraulic → '%HIDRAUL%'. Rueda Delantera: RD, rueda, spindle, husillo → '%RUEDA%'. Mando Final: MF, mando, final drive → '%MANDO%'. Transmisión: trans, TX → '%TRANSMISION%'. Motor (diésel/principal): motor diésel, motor ppal, engine → Compartimiento='MOTOR' (⛔ NO '%MOTOR%': matchearía MOTOR DE TRACCION). Lado: LH/izquierdo/izq → '%LH'; RH/derecho/der → '%RH'. Apodos no listados o componentes sin límites en lc (CAJA GIRO/CG, PTO, DIFERENCIAL, DAMPER) caen en CompTipo 'OTRO' → no disparan observado (ver GUARD). Para añadir un apodo nuevo, agrega su línea aquí: es lo único que se toca. EQUIPO COLOQUIAL: si el usuario da un NÚMERO SUELTO («el 3165», «camión 3165», «equipo 3165») → usa Equipo LIKE '%3165' (matchea CA3165 de Antapaccay o HT### de Antamina, sin adivinar el prefijo); si el proyecto es conocido en contexto, puedes usar 'CA'+nº (Antapaccay) o 'HT'+nº (Antamina). ⛔ NUNCA Equipo='3165' a secas (=0 filas).</w:t>
       </w:r>
     </w:p>
     <w:p>

</xml_diff>

<commit_message>
audit(ejemplos): erradicar códigos de equipo reales en ejemplos → placeholders (raíz, como CA3171→CAxxxx)
Auditoría silenciosa (regla del usuario: ejemplos docx = placeholder, nunca código real; el modelo
los reproduce como dato). Detectados y corregidos:
- Formatos: matriz barrido y «Valores y límites» usaban HT333/HT308/HT323 (reales) → HTxx1/HTxx2/HTxx3.
- Esquema: CA3160/CA3165/CA3174 (ilustrativos de Code, nº-coloquial y mapeo T####→CA####) → genéricos
  (CAxxxx, «el 3XXX»→'%3XXX', T####→CA####).
schema_bd.json: cruzadas TODAS las columnas físicas de DDL e índices — 0 incongruencias.

Co-Authored-By: Claude Opus 4.8 <noreply@anthropic.com>
</commit_message>
<xml_diff>
--- a/docs/copilot/knowledge/Esquema_y_Patrones_SQL.docx
+++ b/docs/copilot/knowledge/Esquema_y_Patrones_SQL.docx
@@ -82,7 +82,7 @@
           <w:color w:val="1F497D"/>
           <w:sz w:val="32"/>
         </w:rPr>
-        <w:t>[Mine].[MiningEquipment] — Id(PK, uniqueidentifier), Code (ej. 'CA3160' = la columna del equipo; NUNCA existe EquipmentCode/EquipmentId), MiningProjectId(FK), EquipmentFleetId(FK).</w:t>
+        <w:t>[Mine].[MiningEquipment] — Id(PK, uniqueidentifier), Code (ej. 'CAxxxx' = la columna del equipo; NUNCA existe EquipmentCode/EquipmentId), MiningProjectId(FK), EquipmentFleetId(FK).</w:t>
       </w:r>
     </w:p>
     <w:p>
@@ -363,7 +363,7 @@
     </w:p>
     <w:p>
       <w:r>
-        <w:t>DICCIONARIO DE APODOS/SIGLAS → keyword LIKE (TRADUCE SIEMPRE el apodo del usuario al keyword canónico; el LIKE usa el keyword, ⛔ NUNCA la sigla literal — '%MT%' no matchea 'MOTOR DE TRACCION'). Motor de Tracción: MT, motor tracción, wheel motor, WM → '%TRACCION%'. Sistema Hidráulico: SH, hidr., hidráulico, hydraulic → '%HIDRAUL%'. Rueda Delantera: RD, rueda, spindle, husillo → '%RUEDA%'. Mando Final: MF, mando, final drive → '%MANDO%'. Transmisión: trans, TX → '%TRANSMISION%'. Motor (diésel/principal): motor diésel, motor ppal, engine → Compartimiento='MOTOR' (⛔ NO '%MOTOR%': matchearía MOTOR DE TRACCION). Lado: LH/izquierdo/izq → '%LH'; RH/derecho/der → '%RH'. Apodos no listados o componentes sin límites en lc (CAJA GIRO/CG, PTO, DIFERENCIAL, DAMPER) caen en CompTipo 'OTRO' → no disparan observado (ver GUARD). Para añadir un apodo nuevo, agrega su línea aquí: es lo único que se toca. EQUIPO COLOQUIAL: si el usuario da un NÚMERO SUELTO («el 3165», «camión 3165», «equipo 3165») → usa Equipo LIKE '%3165' (matchea CA3165 de Antapaccay o HT### de Antamina, sin adivinar el prefijo); si el proyecto es conocido en contexto, puedes usar 'CA'+nº (Antapaccay) o 'HT'+nº (Antamina). ⛔ NUNCA Equipo='3165' a secas (=0 filas).</w:t>
+        <w:t>DICCIONARIO DE APODOS/SIGLAS → keyword LIKE (TRADUCE SIEMPRE el apodo del usuario al keyword canónico; el LIKE usa el keyword, ⛔ NUNCA la sigla literal — '%MT%' no matchea 'MOTOR DE TRACCION'). Motor de Tracción: MT, motor tracción, wheel motor, WM → '%TRACCION%'. Sistema Hidráulico: SH, hidr., hidráulico, hydraulic → '%HIDRAUL%'. Rueda Delantera: RD, rueda, spindle, husillo → '%RUEDA%'. Mando Final: MF, mando, final drive → '%MANDO%'. Transmisión: trans, TX → '%TRANSMISION%'. Motor (diésel/principal): motor diésel, motor ppal, engine → Compartimiento='MOTOR' (⛔ NO '%MOTOR%': matchearía MOTOR DE TRACCION). Lado: LH/izquierdo/izq → '%LH'; RH/derecho/der → '%RH'. Apodos no listados o componentes sin límites en lc (CAJA GIRO/CG, PTO, DIFERENCIAL, DAMPER) caen en CompTipo 'OTRO' → no disparan observado (ver GUARD). Para añadir un apodo nuevo, agrega su línea aquí: es lo único que se toca. EQUIPO COLOQUIAL: si el usuario da un NÚMERO SUELTO («el 3XXX», «camión 3XXX», «equipo 3XXX») → usa Equipo LIKE '%3XXX' (matchea CAxxxx de Antapaccay o HTxxx de Antamina, sin adivinar el prefijo); si el proyecto es conocido en contexto, puedes usar 'CA'+nº (Antapaccay) o 'HT'+nº (Antamina). ⛔ NUNCA Equipo='3165' a secas (=0 filas).</w:t>
       </w:r>
     </w:p>
     <w:p>
@@ -398,7 +398,7 @@
           <w:color w:val="1F497D"/>
           <w:sz w:val="32"/>
         </w:rPr>
-        <w:t>NAMING / GOTCHAS: Equipo = ME.[Code] o columna Equipo de la vista (NUNCA EquipmentCode/EquipmentId). Lado: izquierdo=LH, derecho=RH → Compartimiento LIKE '%LH'/'%RH'. Antapaccay → flota 980E (sin proyecto mencionado, no fuerces 980E). HsCc usa 'T3174' donde ME.Code es 'CA3174' (las vistas resuelven T####→CA####) y [SISTEMA] en inglés para 980E (WHEEL MOTOR LH/RH↔MT, HYDRAULIC↔HIDRÁULICO, SPINDLE↔RUEDA, MOTOR DIESEL↔MOTOR). Pb/Sn/TBN no tienen _LC. TBN es INVERSO (precaución si &lt; TBN_LP). Ca/Zn/K/Na/Mg/B/P son informativos: no alteran Estado_General ni el triage (pero sí llevan recomendación si están fuera de umbral).</w:t>
+        <w:t>NAMING / GOTCHAS: Equipo = ME.[Code] o columna Equipo de la vista (NUNCA EquipmentCode/EquipmentId). Lado: izquierdo=LH, derecho=RH → Compartimiento LIKE '%LH'/'%RH'. Antapaccay → flota 980E (sin proyecto mencionado, no fuerces 980E). HsCc usa 'T####' donde ME.Code es 'CA####' (las vistas resuelven T####→CA####) y [SISTEMA] en inglés para 980E (WHEEL MOTOR LH/RH↔MT, HYDRAULIC↔HIDRÁULICO, SPINDLE↔RUEDA, MOTOR DIESEL↔MOTOR). Pb/Sn/TBN no tienen _LC. TBN es INVERSO (precaución si &lt; TBN_LP). Ca/Zn/K/Na/Mg/B/P son informativos: no alteran Estado_General ni el triage (pero sí llevan recomendación si están fuera de umbral).</w:t>
       </w:r>
     </w:p>
     <w:p>

</xml_diff>